<commit_message>
Fix washed-out text in templates; split Invite/Proposal download into separate checkboxes
- Force explicit black font color on all body text runs in both .docx
  templates (previously relying on Automatic color, which some MS Word
  configurations render as washed-out/illegible). Hyperlink colors
  untouched.
- generateCompanyDocs/downloadCompanyDocs now take an options arg
  ({ invite, proposal }, both default true) so callers can generate just
  one of the two documents.
- UI: replaced the single 'include docs' checkbox with separate Invite
  and Proposal checkboxes in both the Preview step and the Generate step.
</commit_message>
<xml_diff>
--- a/public/templates/official-invite.docx
+++ b/public/templates/official-invite.docx
@@ -16,6 +16,7 @@
       <w:r>
         <w:rPr>
           <w:rFonts w:ascii="Times New Roman" w:cs="Times New Roman" w:eastAsia="Times New Roman" w:hAnsi="Times New Roman"/>
+          <w:color w:val="000000"/>
           <w:sz w:val="24"/>
           <w:szCs w:val="24"/>
           <w:rtl w:val="0"/>
@@ -37,6 +38,7 @@
       <w:r>
         <w:rPr>
           <w:rFonts w:ascii="Times New Roman" w:cs="Times New Roman" w:eastAsia="Times New Roman" w:hAnsi="Times New Roman"/>
+          <w:color w:val="000000"/>
           <w:sz w:val="24"/>
           <w:szCs w:val="24"/>
           <w:rtl w:val="0"/>
@@ -48,6 +50,7 @@
           <w:rFonts w:ascii="Times New Roman" w:cs="Times New Roman" w:eastAsia="Times New Roman" w:hAnsi="Times New Roman"/>
           <w:b w:val="1"/>
           <w:bCs w:val="1"/>
+          <w:color w:val="000000"/>
           <w:sz w:val="24"/>
           <w:szCs w:val="24"/>
           <w:rtl w:val="0"/>
@@ -57,6 +60,7 @@
       <w:r>
         <w:rPr>
           <w:rFonts w:ascii="Times New Roman" w:cs="Times New Roman" w:eastAsia="Times New Roman" w:hAnsi="Times New Roman"/>
+          <w:color w:val="000000"/>
           <w:sz w:val="24"/>
           <w:szCs w:val="24"/>
           <w:rtl w:val="0"/>
@@ -68,6 +72,7 @@
           <w:rFonts w:ascii="Times New Roman" w:cs="Times New Roman" w:eastAsia="Times New Roman" w:hAnsi="Times New Roman"/>
           <w:b w:val="1"/>
           <w:bCs w:val="1"/>
+          <w:color w:val="000000"/>
           <w:sz w:val="24"/>
           <w:szCs w:val="24"/>
           <w:rtl w:val="0"/>
@@ -77,6 +82,7 @@
       <w:r>
         <w:rPr>
           <w:rFonts w:ascii="Times New Roman" w:cs="Times New Roman" w:eastAsia="Times New Roman" w:hAnsi="Times New Roman"/>
+          <w:color w:val="000000"/>
           <w:sz w:val="24"/>
           <w:szCs w:val="24"/>
           <w:rtl w:val="0"/>
@@ -88,6 +94,7 @@
           <w:rFonts w:ascii="Times New Roman" w:cs="Times New Roman" w:eastAsia="Times New Roman" w:hAnsi="Times New Roman"/>
           <w:b w:val="1"/>
           <w:bCs w:val="1"/>
+          <w:color w:val="000000"/>
           <w:sz w:val="24"/>
           <w:szCs w:val="24"/>
           <w:rtl w:val="0"/>
@@ -97,6 +104,7 @@
       <w:r>
         <w:rPr>
           <w:rFonts w:ascii="Times New Roman" w:cs="Times New Roman" w:eastAsia="Times New Roman" w:hAnsi="Times New Roman"/>
+          <w:color w:val="000000"/>
           <w:sz w:val="24"/>
           <w:szCs w:val="24"/>
           <w:rtl w:val="0"/>
@@ -118,6 +126,7 @@
       <w:r>
         <w:rPr>
           <w:rFonts w:ascii="Times New Roman" w:cs="Times New Roman" w:eastAsia="Times New Roman" w:hAnsi="Times New Roman"/>
+          <w:color w:val="000000"/>
           <w:sz w:val="24"/>
           <w:szCs w:val="24"/>
           <w:rtl w:val="0"/>
@@ -129,6 +138,7 @@
           <w:rFonts w:ascii="Times New Roman" w:cs="Times New Roman" w:eastAsia="Times New Roman" w:hAnsi="Times New Roman"/>
           <w:b w:val="1"/>
           <w:bCs w:val="1"/>
+          <w:color w:val="000000"/>
           <w:sz w:val="24"/>
           <w:szCs w:val="24"/>
           <w:rtl w:val="0"/>
@@ -138,6 +148,7 @@
       <w:r>
         <w:rPr>
           <w:rFonts w:ascii="Times New Roman" w:cs="Times New Roman" w:eastAsia="Times New Roman" w:hAnsi="Times New Roman"/>
+          <w:color w:val="000000"/>
           <w:sz w:val="24"/>
           <w:szCs w:val="24"/>
           <w:rtl w:val="0"/>
@@ -149,6 +160,7 @@
           <w:rFonts w:ascii="Times New Roman" w:cs="Times New Roman" w:eastAsia="Times New Roman" w:hAnsi="Times New Roman"/>
           <w:b w:val="1"/>
           <w:bCs w:val="1"/>
+          <w:color w:val="000000"/>
           <w:sz w:val="24"/>
           <w:szCs w:val="24"/>
           <w:rtl w:val="0"/>
@@ -158,6 +170,7 @@
       <w:r>
         <w:rPr>
           <w:rFonts w:ascii="Times New Roman" w:cs="Times New Roman" w:eastAsia="Times New Roman" w:hAnsi="Times New Roman"/>
+          <w:color w:val="000000"/>
           <w:sz w:val="24"/>
           <w:szCs w:val="24"/>
           <w:rtl w:val="0"/>
@@ -169,6 +182,7 @@
           <w:rFonts w:ascii="Times New Roman" w:cs="Times New Roman" w:eastAsia="Times New Roman" w:hAnsi="Times New Roman"/>
           <w:b w:val="1"/>
           <w:bCs w:val="1"/>
+          <w:color w:val="000000"/>
           <w:sz w:val="24"/>
           <w:szCs w:val="24"/>
           <w:rtl w:val="0"/>
@@ -178,6 +192,7 @@
       <w:r>
         <w:rPr>
           <w:rFonts w:ascii="Times New Roman" w:cs="Times New Roman" w:eastAsia="Times New Roman" w:hAnsi="Times New Roman"/>
+          <w:color w:val="000000"/>
           <w:sz w:val="24"/>
           <w:szCs w:val="24"/>
           <w:rtl w:val="0"/>
@@ -189,6 +204,7 @@
           <w:rFonts w:ascii="Times New Roman" w:cs="Times New Roman" w:eastAsia="Times New Roman" w:hAnsi="Times New Roman"/>
           <w:b w:val="1"/>
           <w:bCs w:val="1"/>
+          <w:color w:val="000000"/>
           <w:sz w:val="24"/>
           <w:szCs w:val="24"/>
           <w:rtl w:val="0"/>
@@ -198,6 +214,7 @@
       <w:r>
         <w:rPr>
           <w:rFonts w:ascii="Times New Roman" w:cs="Times New Roman" w:eastAsia="Times New Roman" w:hAnsi="Times New Roman"/>
+          <w:color w:val="000000"/>
           <w:sz w:val="24"/>
           <w:szCs w:val="24"/>
           <w:rtl w:val="0"/>
@@ -219,6 +236,7 @@
       <w:r>
         <w:rPr>
           <w:rFonts w:ascii="Times New Roman" w:cs="Times New Roman" w:eastAsia="Times New Roman" w:hAnsi="Times New Roman"/>
+          <w:color w:val="000000"/>
           <w:sz w:val="24"/>
           <w:szCs w:val="24"/>
           <w:rtl w:val="0"/>
@@ -230,6 +248,7 @@
           <w:rFonts w:ascii="Times New Roman" w:cs="Times New Roman" w:eastAsia="Times New Roman" w:hAnsi="Times New Roman"/>
           <w:b w:val="1"/>
           <w:bCs w:val="1"/>
+          <w:color w:val="000000"/>
           <w:sz w:val="24"/>
           <w:szCs w:val="24"/>
           <w:rtl w:val="0"/>
@@ -239,6 +258,7 @@
       <w:r>
         <w:rPr>
           <w:rFonts w:ascii="Times New Roman" w:cs="Times New Roman" w:eastAsia="Times New Roman" w:hAnsi="Times New Roman"/>
+          <w:color w:val="000000"/>
           <w:sz w:val="24"/>
           <w:szCs w:val="24"/>
           <w:rtl w:val="0"/>
@@ -250,6 +270,7 @@
           <w:rFonts w:ascii="Times New Roman" w:cs="Times New Roman" w:eastAsia="Times New Roman" w:hAnsi="Times New Roman"/>
           <w:b w:val="1"/>
           <w:bCs w:val="1"/>
+          <w:color w:val="000000"/>
           <w:sz w:val="24"/>
           <w:szCs w:val="24"/>
           <w:rtl w:val="0"/>
@@ -259,6 +280,7 @@
       <w:r>
         <w:rPr>
           <w:rFonts w:ascii="Times New Roman" w:cs="Times New Roman" w:eastAsia="Times New Roman" w:hAnsi="Times New Roman"/>
+          <w:color w:val="000000"/>
           <w:sz w:val="24"/>
           <w:szCs w:val="24"/>
           <w:rtl w:val="0"/>
@@ -270,6 +292,7 @@
           <w:rFonts w:ascii="Times New Roman" w:cs="Times New Roman" w:eastAsia="Times New Roman" w:hAnsi="Times New Roman"/>
           <w:b w:val="1"/>
           <w:bCs w:val="1"/>
+          <w:color w:val="000000"/>
           <w:sz w:val="24"/>
           <w:szCs w:val="24"/>
           <w:rtl w:val="0"/>
@@ -279,6 +302,7 @@
       <w:r>
         <w:rPr>
           <w:rFonts w:ascii="Times New Roman" w:cs="Times New Roman" w:eastAsia="Times New Roman" w:hAnsi="Times New Roman"/>
+          <w:color w:val="000000"/>
           <w:sz w:val="24"/>
           <w:szCs w:val="24"/>
           <w:rtl w:val="0"/>
@@ -290,6 +314,7 @@
           <w:rFonts w:ascii="Times New Roman" w:cs="Times New Roman" w:eastAsia="Times New Roman" w:hAnsi="Times New Roman"/>
           <w:b w:val="1"/>
           <w:bCs w:val="1"/>
+          <w:color w:val="000000"/>
           <w:sz w:val="24"/>
           <w:szCs w:val="24"/>
           <w:rtl w:val="0"/>
@@ -299,6 +324,7 @@
       <w:r>
         <w:rPr>
           <w:rFonts w:ascii="Times New Roman" w:cs="Times New Roman" w:eastAsia="Times New Roman" w:hAnsi="Times New Roman"/>
+          <w:color w:val="000000"/>
           <w:sz w:val="24"/>
           <w:szCs w:val="24"/>
           <w:rtl w:val="0"/>
@@ -320,6 +346,7 @@
       <w:r>
         <w:rPr>
           <w:rFonts w:ascii="Times New Roman" w:cs="Times New Roman" w:eastAsia="Times New Roman" w:hAnsi="Times New Roman"/>
+          <w:color w:val="000000"/>
           <w:sz w:val="24"/>
           <w:szCs w:val="24"/>
           <w:rtl w:val="0"/>
@@ -331,6 +358,7 @@
           <w:rFonts w:ascii="Times New Roman" w:cs="Times New Roman" w:eastAsia="Times New Roman" w:hAnsi="Times New Roman"/>
           <w:b w:val="1"/>
           <w:bCs w:val="1"/>
+          <w:color w:val="000000"/>
           <w:sz w:val="24"/>
           <w:szCs w:val="24"/>
           <w:rtl w:val="0"/>
@@ -340,6 +368,7 @@
       <w:r>
         <w:rPr>
           <w:rFonts w:ascii="Times New Roman" w:cs="Times New Roman" w:eastAsia="Times New Roman" w:hAnsi="Times New Roman"/>
+          <w:color w:val="000000"/>
           <w:sz w:val="24"/>
           <w:szCs w:val="24"/>
           <w:rtl w:val="0"/>
@@ -351,6 +380,7 @@
           <w:rFonts w:ascii="Times New Roman" w:cs="Times New Roman" w:eastAsia="Times New Roman" w:hAnsi="Times New Roman"/>
           <w:b w:val="1"/>
           <w:bCs w:val="1"/>
+          <w:color w:val="000000"/>
           <w:sz w:val="24"/>
           <w:szCs w:val="24"/>
           <w:rtl w:val="0"/>
@@ -360,6 +390,7 @@
       <w:r>
         <w:rPr>
           <w:rFonts w:ascii="Times New Roman" w:cs="Times New Roman" w:eastAsia="Times New Roman" w:hAnsi="Times New Roman"/>
+          <w:color w:val="000000"/>
           <w:sz w:val="24"/>
           <w:szCs w:val="24"/>
           <w:rtl w:val="0"/>
@@ -371,6 +402,7 @@
           <w:rFonts w:ascii="Times New Roman" w:cs="Times New Roman" w:eastAsia="Times New Roman" w:hAnsi="Times New Roman"/>
           <w:b w:val="1"/>
           <w:bCs w:val="1"/>
+          <w:color w:val="000000"/>
           <w:sz w:val="24"/>
           <w:szCs w:val="24"/>
           <w:rtl w:val="0"/>
@@ -380,6 +412,7 @@
       <w:r>
         <w:rPr>
           <w:rFonts w:ascii="Times New Roman" w:cs="Times New Roman" w:eastAsia="Times New Roman" w:hAnsi="Times New Roman"/>
+          <w:color w:val="000000"/>
           <w:sz w:val="24"/>
           <w:szCs w:val="24"/>
           <w:rtl w:val="0"/>
@@ -391,6 +424,7 @@
           <w:rFonts w:ascii="Times New Roman" w:cs="Times New Roman" w:eastAsia="Times New Roman" w:hAnsi="Times New Roman"/>
           <w:b w:val="1"/>
           <w:bCs w:val="1"/>
+          <w:color w:val="000000"/>
           <w:sz w:val="24"/>
           <w:szCs w:val="24"/>
           <w:rtl w:val="0"/>
@@ -400,6 +434,7 @@
       <w:r>
         <w:rPr>
           <w:rFonts w:ascii="Times New Roman" w:cs="Times New Roman" w:eastAsia="Times New Roman" w:hAnsi="Times New Roman"/>
+          <w:color w:val="000000"/>
           <w:sz w:val="24"/>
           <w:szCs w:val="24"/>
           <w:rtl w:val="0"/>
@@ -421,6 +456,7 @@
       <w:r>
         <w:rPr>
           <w:rFonts w:ascii="Times New Roman" w:cs="Times New Roman" w:eastAsia="Times New Roman" w:hAnsi="Times New Roman"/>
+          <w:color w:val="000000"/>
           <w:sz w:val="24"/>
           <w:szCs w:val="24"/>
           <w:rtl w:val="0"/>
@@ -432,6 +468,7 @@
           <w:rFonts w:ascii="Times New Roman" w:cs="Times New Roman" w:eastAsia="Times New Roman" w:hAnsi="Times New Roman"/>
           <w:b w:val="1"/>
           <w:bCs w:val="1"/>
+          <w:color w:val="000000"/>
           <w:sz w:val="24"/>
           <w:szCs w:val="24"/>
           <w:rtl w:val="0"/>
@@ -441,6 +478,7 @@
       <w:r>
         <w:rPr>
           <w:rFonts w:ascii="Times New Roman" w:cs="Times New Roman" w:eastAsia="Times New Roman" w:hAnsi="Times New Roman"/>
+          <w:color w:val="000000"/>
           <w:sz w:val="24"/>
           <w:szCs w:val="24"/>
           <w:rtl w:val="0"/>
@@ -462,6 +500,7 @@
       <w:r>
         <w:rPr>
           <w:rFonts w:ascii="Times New Roman" w:cs="Times New Roman" w:eastAsia="Times New Roman" w:hAnsi="Times New Roman"/>
+          <w:color w:val="000000"/>
           <w:sz w:val="24"/>
           <w:szCs w:val="24"/>
           <w:rtl w:val="0"/>
@@ -483,6 +522,7 @@
       <w:r>
         <w:rPr>
           <w:rFonts w:ascii="Times New Roman" w:cs="Times New Roman" w:eastAsia="Times New Roman" w:hAnsi="Times New Roman"/>
+          <w:color w:val="000000"/>
           <w:sz w:val="24"/>
           <w:szCs w:val="24"/>
           <w:rtl w:val="0"/>
@@ -504,6 +544,7 @@
       <w:r>
         <w:rPr>
           <w:rFonts w:ascii="Times New Roman" w:cs="Times New Roman" w:eastAsia="Times New Roman" w:hAnsi="Times New Roman"/>
+          <w:color w:val="000000"/>
           <w:sz w:val="24"/>
           <w:szCs w:val="24"/>
           <w:rtl w:val="0"/>
@@ -537,6 +578,7 @@
       </w:hyperlink>
       <w:r>
         <w:rPr>
+          <w:color w:val="000000"/>
           <w:rtl w:val="0"/>
         </w:rPr>
       </w:r>
@@ -555,6 +597,7 @@
       <w:r>
         <w:rPr>
           <w:rFonts w:ascii="Times New Roman" w:cs="Times New Roman" w:eastAsia="Times New Roman" w:hAnsi="Times New Roman"/>
+          <w:color w:val="000000"/>
           <w:sz w:val="24"/>
           <w:szCs w:val="24"/>
           <w:rtl w:val="0"/>
@@ -588,6 +631,7 @@
       </w:hyperlink>
       <w:r>
         <w:rPr>
+          <w:color w:val="000000"/>
           <w:rtl w:val="0"/>
         </w:rPr>
       </w:r>
@@ -618,18 +662,54 @@
       </w:hyperlink>
       <w:r>
         <w:rPr>
+          <w:color w:val="000000"/>
           <w:rtl w:val="0"/>
         </w:rPr>
       </w:r>
     </w:p>
     <w:sectPr>
       <w:headerReference r:id="rId9" w:type="default"/>
+      <w:footerReference w:type="default" r:id="rId10"/>
+      <w:headerReference w:type="first" r:id="rId11"/>
+      <w:footerReference w:type="first" r:id="rId12"/>
+      <w:headerReference w:type="even" r:id="rId13"/>
+      <w:footerReference w:type="even" r:id="rId14"/>
       <w:pgSz w:h="16838" w:w="11906" w:orient="portrait"/>
       <w:pgMar w:bottom="2174" w:top="2448" w:left="1440" w:right="1440" w:header="1008" w:footer="1008"/>
       <w:pgNumType w:start="1"/>
     </w:sectPr>
   </w:body>
 </w:document>
+</file>
+
+<file path=word/footer1.xml><?xml version="1.0" encoding="utf-8"?>
+<w:ftr xmlns:m="http://schemas.openxmlformats.org/officeDocument/2006/math" xmlns:mc="http://schemas.openxmlformats.org/markup-compatibility/2006" xmlns:mo="http://schemas.microsoft.com/office/mac/office/2008/main" xmlns:mv="urn:schemas-microsoft-com:mac:vml" xmlns:o="urn:schemas-microsoft-com:office:office" xmlns:r="http://schemas.openxmlformats.org/officeDocument/2006/relationships" xmlns:v="urn:schemas-microsoft-com:vml" xmlns:w10="urn:schemas-microsoft-com:office:word" xmlns:w14="http://schemas.microsoft.com/office/word/2010/wordml" xmlns:w="http://schemas.openxmlformats.org/wordprocessingml/2006/main" xmlns:wne="http://schemas.microsoft.com/office/word/2006/wordml" xmlns:wp14="http://schemas.microsoft.com/office/word/2010/wordprocessingDrawing" xmlns:wp="http://schemas.openxmlformats.org/drawingml/2006/wordprocessingDrawing" xmlns:wpc="http://schemas.microsoft.com/office/word/2010/wordprocessingCanvas" xmlns:wpg="http://schemas.microsoft.com/office/word/2010/wordprocessingGroup" xmlns:wpi="http://schemas.microsoft.com/office/word/2010/wordprocessingInk" xmlns:wps="http://schemas.microsoft.com/office/word/2010/wordprocessingShape" mc:Ignorable="w14 wp14">
+  <w:p>
+    <w:pPr>
+      <w:pStyle w:val="Footer"/>
+    </w:pPr>
+  </w:p>
+</w:ftr>
+</file>
+
+<file path=word/footer2.xml><?xml version="1.0" encoding="utf-8"?>
+<w:ftr xmlns:m="http://schemas.openxmlformats.org/officeDocument/2006/math" xmlns:mc="http://schemas.openxmlformats.org/markup-compatibility/2006" xmlns:mo="http://schemas.microsoft.com/office/mac/office/2008/main" xmlns:mv="urn:schemas-microsoft-com:mac:vml" xmlns:o="urn:schemas-microsoft-com:office:office" xmlns:r="http://schemas.openxmlformats.org/officeDocument/2006/relationships" xmlns:v="urn:schemas-microsoft-com:vml" xmlns:w10="urn:schemas-microsoft-com:office:word" xmlns:w14="http://schemas.microsoft.com/office/word/2010/wordml" xmlns:w="http://schemas.openxmlformats.org/wordprocessingml/2006/main" xmlns:wne="http://schemas.microsoft.com/office/word/2006/wordml" xmlns:wp14="http://schemas.microsoft.com/office/word/2010/wordprocessingDrawing" xmlns:wp="http://schemas.openxmlformats.org/drawingml/2006/wordprocessingDrawing" xmlns:wpc="http://schemas.microsoft.com/office/word/2010/wordprocessingCanvas" xmlns:wpg="http://schemas.microsoft.com/office/word/2010/wordprocessingGroup" xmlns:wpi="http://schemas.microsoft.com/office/word/2010/wordprocessingInk" xmlns:wps="http://schemas.microsoft.com/office/word/2010/wordprocessingShape" mc:Ignorable="w14 wp14">
+  <w:p>
+    <w:pPr>
+      <w:pStyle w:val="Footer"/>
+    </w:pPr>
+  </w:p>
+</w:ftr>
+</file>
+
+<file path=word/footer3.xml><?xml version="1.0" encoding="utf-8"?>
+<w:ftr xmlns:m="http://schemas.openxmlformats.org/officeDocument/2006/math" xmlns:mc="http://schemas.openxmlformats.org/markup-compatibility/2006" xmlns:mo="http://schemas.microsoft.com/office/mac/office/2008/main" xmlns:mv="urn:schemas-microsoft-com:mac:vml" xmlns:o="urn:schemas-microsoft-com:office:office" xmlns:r="http://schemas.openxmlformats.org/officeDocument/2006/relationships" xmlns:v="urn:schemas-microsoft-com:vml" xmlns:w10="urn:schemas-microsoft-com:office:word" xmlns:w14="http://schemas.microsoft.com/office/word/2010/wordml" xmlns:w="http://schemas.openxmlformats.org/wordprocessingml/2006/main" xmlns:wne="http://schemas.microsoft.com/office/word/2006/wordml" xmlns:wp14="http://schemas.microsoft.com/office/word/2010/wordprocessingDrawing" xmlns:wp="http://schemas.openxmlformats.org/drawingml/2006/wordprocessingDrawing" xmlns:wpc="http://schemas.microsoft.com/office/word/2010/wordprocessingCanvas" xmlns:wpg="http://schemas.microsoft.com/office/word/2010/wordprocessingGroup" xmlns:wpi="http://schemas.microsoft.com/office/word/2010/wordprocessingInk" xmlns:wps="http://schemas.microsoft.com/office/word/2010/wordprocessingShape" mc:Ignorable="w14 wp14">
+  <w:p>
+    <w:pPr>
+      <w:pStyle w:val="Footer"/>
+    </w:pPr>
+  </w:p>
+</w:ftr>
 </file>
 
 <file path=word/header1.xml><?xml version="1.0" encoding="utf-8"?>
@@ -653,7 +733,9 @@
       </w:rPr>
     </w:pPr>
     <w:r>
-      <w:rPr/>
+      <w:rPr>
+        <w:color w:val="000000"/>
+      </w:rPr>
       <w:drawing>
         <wp:anchor allowOverlap="1" behindDoc="1" distB="0" distT="0" distL="0" distR="0" hidden="0" layoutInCell="1" locked="0" relativeHeight="0" simplePos="0">
           <wp:simplePos x="0" y="0"/>
@@ -697,9 +779,30 @@
     </w:r>
     <w:r>
       <w:rPr>
+        <w:color w:val="000000"/>
         <w:rtl w:val="0"/>
       </w:rPr>
     </w:r>
+  </w:p>
+</w:hdr>
+</file>
+
+<file path=word/header2.xml><?xml version="1.0" encoding="utf-8"?>
+<w:hdr xmlns:m="http://schemas.openxmlformats.org/officeDocument/2006/math" xmlns:mc="http://schemas.openxmlformats.org/markup-compatibility/2006" xmlns:mo="http://schemas.microsoft.com/office/mac/office/2008/main" xmlns:mv="urn:schemas-microsoft-com:mac:vml" xmlns:o="urn:schemas-microsoft-com:office:office" xmlns:r="http://schemas.openxmlformats.org/officeDocument/2006/relationships" xmlns:v="urn:schemas-microsoft-com:vml" xmlns:w10="urn:schemas-microsoft-com:office:word" xmlns:w14="http://schemas.microsoft.com/office/word/2010/wordml" xmlns:w="http://schemas.openxmlformats.org/wordprocessingml/2006/main" xmlns:wne="http://schemas.microsoft.com/office/word/2006/wordml" xmlns:wp14="http://schemas.microsoft.com/office/word/2010/wordprocessingDrawing" xmlns:wp="http://schemas.openxmlformats.org/drawingml/2006/wordprocessingDrawing" xmlns:wpc="http://schemas.microsoft.com/office/word/2010/wordprocessingCanvas" xmlns:wpg="http://schemas.microsoft.com/office/word/2010/wordprocessingGroup" xmlns:wpi="http://schemas.microsoft.com/office/word/2010/wordprocessingInk" xmlns:wps="http://schemas.microsoft.com/office/word/2010/wordprocessingShape" mc:Ignorable="w14 wp14">
+  <w:p>
+    <w:pPr>
+      <w:pStyle w:val="Header"/>
+    </w:pPr>
+  </w:p>
+</w:hdr>
+</file>
+
+<file path=word/header3.xml><?xml version="1.0" encoding="utf-8"?>
+<w:hdr xmlns:m="http://schemas.openxmlformats.org/officeDocument/2006/math" xmlns:mc="http://schemas.openxmlformats.org/markup-compatibility/2006" xmlns:mo="http://schemas.microsoft.com/office/mac/office/2008/main" xmlns:mv="urn:schemas-microsoft-com:mac:vml" xmlns:o="urn:schemas-microsoft-com:office:office" xmlns:r="http://schemas.openxmlformats.org/officeDocument/2006/relationships" xmlns:v="urn:schemas-microsoft-com:vml" xmlns:w10="urn:schemas-microsoft-com:office:word" xmlns:w14="http://schemas.microsoft.com/office/word/2010/wordml" xmlns:w="http://schemas.openxmlformats.org/wordprocessingml/2006/main" xmlns:wne="http://schemas.microsoft.com/office/word/2006/wordml" xmlns:wp14="http://schemas.microsoft.com/office/word/2010/wordprocessingDrawing" xmlns:wp="http://schemas.openxmlformats.org/drawingml/2006/wordprocessingDrawing" xmlns:wpc="http://schemas.microsoft.com/office/word/2010/wordprocessingCanvas" xmlns:wpg="http://schemas.microsoft.com/office/word/2010/wordprocessingGroup" xmlns:wpi="http://schemas.microsoft.com/office/word/2010/wordprocessingInk" xmlns:wps="http://schemas.microsoft.com/office/word/2010/wordprocessingShape" mc:Ignorable="w14 wp14">
+  <w:p>
+    <w:pPr>
+      <w:pStyle w:val="Header"/>
+    </w:pPr>
   </w:p>
 </w:hdr>
 </file>

</xml_diff>